<commit_message>
docs(uat-manual): add stock reports, statements detail, layby ageing
Bring the UAT manual in line with main after Slice J (stock report pages) and
Slice K (statements + layby ageing) merged:
- §10.5 Stock reports (new) — stock card, negative stock, fast/slow movers;
  STOCK.READ gate + empty-state note (US-RPT-004/005/006).
- §10.6 Statements — typeahead→Run flow + customer-statement deep-link (US-RPT-007).
- §10.7 Layby & pre-order ageing (new) — KPI strip, bucket table, drill-down,
  LAYBY/PRE_ORDER chips, ORDER.READ gate (US-RPT-014).
- §10.8 checklist extended for the new pages + permission gates.
- §11 corrected the stale "layby/pre-orders not shipped" line (ageing report
  IS shipped; only till capture is Phase 1.1).
- Annex A adds STOCK.READ and ORDER.READ; cover date → 2026-05-29.

Regenerated Orbix-Engine-UAT-Manual.docx from the updated generator.

Co-Authored-By: Claude Opus 4.8 (1M context) <noreply@anthropic.com>
</commit_message>
<xml_diff>
--- a/docs/manuals/Orbix-Engine-UAT-Manual.docx
+++ b/docs/manuals/Orbix-Engine-UAT-Manual.docx
@@ -37,7 +37,7 @@
           <w:color w:val="808080"/>
           <w:sz w:val="22"/>
         </w:rPr>
-        <w:t>Phase 1 MVP · 2026-05-28</w:t>
+        <w:t>Phase 1 MVP · 2026-05-29</w:t>
       </w:r>
     </w:p>
     <w:p/>
@@ -146,7 +146,7 @@
         <w:ind w:left="283"/>
       </w:pPr>
       <w:r>
-        <w:t>10. Reports — dashboard, sales reports, statements, export</w:t>
+        <w:t>10. Reports — dashboard, sales reports, stock reports, statements, layby ageing, export</w:t>
       </w:r>
     </w:p>
     <w:p>
@@ -2550,7 +2550,17 @@
         <w:rPr>
           <w:color w:val="123A6E"/>
         </w:rPr>
-        <w:t>10.5 Statements (US-RPT-007)</w:t>
+        <w:t>10.5 Stock reports (US-RPT-004/005/006, Slice J)</w:t>
+      </w:r>
+    </w:p>
+    <w:p>
+      <w:r>
+        <w:rPr>
+          <w:b w:val="0"/>
+          <w:i w:val="0"/>
+          <w:sz w:val="22"/>
+        </w:rPr>
+        <w:t>Three stock-side report pages live under Reports. All are gated on STOCK.READ — a cashier (POS perms only) opening any of them sees the Permission required panel, not the data.</w:t>
       </w:r>
     </w:p>
     <w:p>
@@ -2558,7 +2568,7 @@
         <w:pStyle w:val="ListNumber"/>
       </w:pPr>
       <w:r>
-        <w:t>Reports &gt; Customer statement. Pick a customer and date range. Verify opening balance, period entries, running balance, closing balance.</w:t>
+        <w:t>Reports &gt; Stock card. Pick a branch and an item (typeahead). Verify the chronological IN / OUT / ADJUST movement list with a running balance column and the document number per row. This is the same stock card reachable from Stock &gt; On hand, exposed as a standalone report so you can deep-link to it.</w:t>
       </w:r>
     </w:p>
     <w:p>
@@ -2566,7 +2576,7 @@
         <w:pStyle w:val="ListNumber"/>
       </w:pPr>
       <w:r>
-        <w:t>Reports &gt; Supplier statement. Same shape on the AP side.</w:t>
+        <w:t>Reports &gt; Negative stock. Lists items whose on-hand has gone below zero (after an oversell override). On a clean system the list is empty and an empty-state card shows. Where there are rows, click one to drill through to that item's stock card.</w:t>
       </w:r>
     </w:p>
     <w:p>
@@ -2574,7 +2584,25 @@
         <w:pStyle w:val="ListNumber"/>
       </w:pPr>
       <w:r>
-        <w:t>Export to PDF and confirm the layout is readable.</w:t>
+        <w:t>Reports &gt; Stock movers. Two tabs — Fast movers and Slow movers — over a date range (default last 30 days). Switch tabs and verify each ranks items by quantity moved.</w:t>
+      </w:r>
+    </w:p>
+    <w:p>
+      <w:pPr>
+        <w:pStyle w:val="ListNumber"/>
+      </w:pPr>
+      <w:r>
+        <w:t>On any populated page, use the Export [PDF] [Excel] [CSV] button group and confirm a file downloads.</w:t>
+      </w:r>
+    </w:p>
+    <w:p>
+      <w:r>
+        <w:rPr>
+          <w:i/>
+          <w:color w:val="606060"/>
+          <w:sz w:val="20"/>
+        </w:rPr>
+        <w:t>NOTE — The export button only appears when there are rows. On an empty report the empty-state card replaces it — that is expected, not a defect.</w:t>
       </w:r>
     </w:p>
     <w:p>
@@ -2585,7 +2613,103 @@
         <w:rPr>
           <w:color w:val="123A6E"/>
         </w:rPr>
-        <w:t>10.6 Acceptance checklist</w:t>
+        <w:t>10.6 Statements (US-RPT-007, Slice K)</w:t>
+      </w:r>
+    </w:p>
+    <w:p>
+      <w:pPr>
+        <w:pStyle w:val="ListNumber"/>
+      </w:pPr>
+      <w:r>
+        <w:t>Reports &gt; Customer statement. Pick a customer (typeahead — never a raw id) and a date range, then click Run. Verify the KPI strip (opening balance, closing balance), the period entries with a running balance, and CSV / Excel export.</w:t>
+      </w:r>
+    </w:p>
+    <w:p>
+      <w:pPr>
+        <w:pStyle w:val="ListNumber"/>
+      </w:pPr>
+      <w:r>
+        <w:t>You can also deep-link with query params (?customerId=..&amp;from=..&amp;to=..) — the picker pre-loads and the statement fetches without manual interaction.</w:t>
+      </w:r>
+    </w:p>
+    <w:p>
+      <w:pPr>
+        <w:pStyle w:val="ListNumber"/>
+      </w:pPr>
+      <w:r>
+        <w:t>Reports &gt; Supplier statement. Same shape on the AP side; pick a supplier via the typeahead, Run, then export to Excel.</w:t>
+      </w:r>
+    </w:p>
+    <w:p>
+      <w:pPr>
+        <w:pStyle w:val="ListNumber"/>
+      </w:pPr>
+      <w:r>
+        <w:t>Export to PDF and confirm the layout is readable.</w:t>
+      </w:r>
+    </w:p>
+    <w:p>
+      <w:pPr>
+        <w:pStyle w:val="Heading2"/>
+      </w:pPr>
+      <w:r>
+        <w:rPr>
+          <w:color w:val="123A6E"/>
+        </w:rPr>
+        <w:t>10.7 Layby &amp; pre-order ageing (US-RPT-014, Slice K)</w:t>
+      </w:r>
+    </w:p>
+    <w:p>
+      <w:r>
+        <w:rPr>
+          <w:b w:val="0"/>
+          <w:i w:val="0"/>
+          <w:sz w:val="22"/>
+        </w:rPr>
+        <w:t>Tracks customer layby and pre-order commitments by age. Gated on ORDER.READ — a cashier opening it sees the Permission required panel. Layby and pre-order ORDERS themselves are captured on the POS till (Phase 1.1); this report reads and ages whatever orders exist.</w:t>
+      </w:r>
+    </w:p>
+    <w:p>
+      <w:pPr>
+        <w:pStyle w:val="ListNumber"/>
+      </w:pPr>
+      <w:r>
+        <w:t>Reports &gt; Layby ageing (with a branch selected).</w:t>
+      </w:r>
+    </w:p>
+    <w:p>
+      <w:pPr>
+        <w:pStyle w:val="ListNumber"/>
+      </w:pPr>
+      <w:r>
+        <w:t>Verify the per-type KPI strip and the bucket roll-up table (ageing buckets across LAYBY and PRE_ORDER), plus the per-order drill-down rows below.</w:t>
+      </w:r>
+    </w:p>
+    <w:p>
+      <w:pPr>
+        <w:pStyle w:val="ListNumber"/>
+      </w:pPr>
+      <w:r>
+        <w:t>Use the type chips — ALL / LAYBY / PRE_ORDER — to filter. Switching to LAYBY hides the PRE_ORDER rows and vice-versa.</w:t>
+      </w:r>
+    </w:p>
+    <w:p>
+      <w:pPr>
+        <w:pStyle w:val="ListNumber"/>
+      </w:pPr>
+      <w:r>
+        <w:t>Export to PDF.</w:t>
+      </w:r>
+    </w:p>
+    <w:p>
+      <w:pPr>
+        <w:pStyle w:val="Heading2"/>
+      </w:pPr>
+      <w:r>
+        <w:rPr>
+          <w:color w:val="123A6E"/>
+        </w:rPr>
+        <w:t>10.8 Acceptance checklist</w:t>
       </w:r>
     </w:p>
     <w:p>
@@ -2634,6 +2758,54 @@
       </w:pPr>
       <w:r>
         <w:t>[ ]  Row-cap message appears (toast) when trying to export more than 5000 rows.</w:t>
+      </w:r>
+    </w:p>
+    <w:p>
+      <w:pPr>
+        <w:pStyle w:val="ListBullet"/>
+      </w:pPr>
+      <w:r>
+        <w:t>[ ]  Stock card running balance is correct end-to-end (GRN, sale, adjustment, return).</w:t>
+      </w:r>
+    </w:p>
+    <w:p>
+      <w:pPr>
+        <w:pStyle w:val="ListBullet"/>
+      </w:pPr>
+      <w:r>
+        <w:t>[ ]  Negative-stock and stock-movers show a clean empty-state when there is no data (no error, no broken export button).</w:t>
+      </w:r>
+    </w:p>
+    <w:p>
+      <w:pPr>
+        <w:pStyle w:val="ListBullet"/>
+      </w:pPr>
+      <w:r>
+        <w:t>[ ]  A cashier opening Stock card / Negative stock / Stock movers sees the Permission required panel (STOCK.READ gate).</w:t>
+      </w:r>
+    </w:p>
+    <w:p>
+      <w:pPr>
+        <w:pStyle w:val="ListBullet"/>
+      </w:pPr>
+      <w:r>
+        <w:t>[ ]  Customer- and supplier-statement pickers are typeaheads; selecting then clicking Run loads the statement; the customer-statement deep-link pre-loads from query params.</w:t>
+      </w:r>
+    </w:p>
+    <w:p>
+      <w:pPr>
+        <w:pStyle w:val="ListBullet"/>
+      </w:pPr>
+      <w:r>
+        <w:t>[ ]  Layby ageing shows the per-type KPI strip + bucket table + drill-down; the LAYBY / PRE_ORDER chips filter the rows.</w:t>
+      </w:r>
+    </w:p>
+    <w:p>
+      <w:pPr>
+        <w:pStyle w:val="ListBullet"/>
+      </w:pPr>
+      <w:r>
+        <w:t>[ ]  A cashier opening Layby ageing sees the Permission required panel (ORDER.READ gate).</w:t>
       </w:r>
     </w:p>
     <w:p>
@@ -2707,7 +2879,7 @@
         <w:pStyle w:val="ListBullet"/>
       </w:pPr>
       <w:r>
-        <w:t>Phase 1.1 supermarket additions: sections per branch, foreign-currency tender per till, layby + pre-orders, gift cards, weighed items / embedded-weight EAN-13, batch / expiry tracking, section P&amp;L reports.</w:t>
+        <w:t>Phase 1.1 supermarket additions: sections per branch, foreign-currency tender per till, layby + pre-order capture on the till (the ageing report for them IS available — see 10.7), gift cards, weighed items / embedded-weight EAN-13, batch / expiry tracking, section P&amp;L reports.</w:t>
       </w:r>
     </w:p>
     <w:p>
@@ -3403,6 +3575,28 @@
           </w:tcPr>
           <w:p>
             <w:r>
+              <w:t>STOCK.READ</w:t>
+            </w:r>
+          </w:p>
+        </w:tc>
+        <w:tc>
+          <w:tcPr>
+            <w:tcW w:type="dxa" w:w="4986"/>
+          </w:tcPr>
+          <w:p>
+            <w:r>
+              <w:t>Stock controller / accountant (stock reports)</w:t>
+            </w:r>
+          </w:p>
+        </w:tc>
+      </w:tr>
+      <w:tr>
+        <w:tc>
+          <w:tcPr>
+            <w:tcW w:type="dxa" w:w="4986"/>
+          </w:tcPr>
+          <w:p>
+            <w:r>
               <w:t>STOCK.COUNT.APPROVE</w:t>
             </w:r>
           </w:p>
@@ -3436,6 +3630,28 @@
           <w:p>
             <w:r>
               <w:t>Store manager</w:t>
+            </w:r>
+          </w:p>
+        </w:tc>
+      </w:tr>
+      <w:tr>
+        <w:tc>
+          <w:tcPr>
+            <w:tcW w:type="dxa" w:w="4986"/>
+          </w:tcPr>
+          <w:p>
+            <w:r>
+              <w:t>ORDER.READ</w:t>
+            </w:r>
+          </w:p>
+        </w:tc>
+        <w:tc>
+          <w:tcPr>
+            <w:tcW w:type="dxa" w:w="4986"/>
+          </w:tcPr>
+          <w:p>
+            <w:r>
+              <w:t>Accountant (layby / pre-order ageing report)</w:t>
             </w:r>
           </w:p>
         </w:tc>

</xml_diff>